<commit_message>
fix typo in comp2123&2823
</commit_message>
<xml_diff>
--- a/COMP2123_cheatsheet.docx
+++ b/COMP2123_cheatsheet.docx
@@ -168,23 +168,13 @@
         </w:rPr>
         <w:t xml:space="preserve"> -&gt; </w:t>
       </w:r>
-      <w:proofErr w:type="gramStart"/>
       <w:r>
         <w:rPr>
           <w:rFonts w:hint="eastAsia"/>
           <w:sz w:val="15"/>
           <w:szCs w:val="15"/>
         </w:rPr>
-        <w:t>O(</w:t>
-      </w:r>
-      <w:proofErr w:type="gramEnd"/>
-      <w:r>
-        <w:rPr>
-          <w:rFonts w:hint="eastAsia"/>
-          <w:sz w:val="15"/>
-          <w:szCs w:val="15"/>
-        </w:rPr>
-        <w:t>1)</w:t>
+        <w:t>O(1)</w:t>
       </w:r>
       <w:r>
         <w:rPr>
@@ -237,21 +227,22 @@
       </w:pPr>
       <w:r>
         <w:rPr>
-          <w:noProof/>
+          <w:sz w:val="16"/>
+          <w:szCs w:val="16"/>
         </w:rPr>
         <w:drawing>
-          <wp:anchor distT="0" distB="0" distL="114300" distR="114300" simplePos="0" relativeHeight="251661312" behindDoc="0" locked="0" layoutInCell="1" allowOverlap="1" wp14:anchorId="447A14F9" wp14:editId="602EB327">
+          <wp:anchor distT="0" distB="0" distL="114300" distR="114300" simplePos="0" relativeHeight="251661312" behindDoc="0" locked="0" layoutInCell="1" allowOverlap="1" wp14:anchorId="4EE88353" wp14:editId="2751794F">
             <wp:simplePos x="0" y="0"/>
             <wp:positionH relativeFrom="column">
-              <wp:posOffset>40640</wp:posOffset>
+              <wp:posOffset>4855</wp:posOffset>
             </wp:positionH>
             <wp:positionV relativeFrom="paragraph">
-              <wp:posOffset>1597660</wp:posOffset>
+              <wp:posOffset>1580296</wp:posOffset>
             </wp:positionV>
-            <wp:extent cx="1803712" cy="967740"/>
-            <wp:effectExtent l="0" t="0" r="0" b="0"/>
+            <wp:extent cx="1597306" cy="904869"/>
+            <wp:effectExtent l="0" t="0" r="3175" b="0"/>
             <wp:wrapNone/>
-            <wp:docPr id="1939739568" name="Picture 1" descr="A diagram of a tree&#10;&#10;AI-generated content may be incorrect."/>
+            <wp:docPr id="121382152" name="Picture 1" descr="A diagram of a tree&#10;&#10;AI-generated content may be incorrect."/>
             <wp:cNvGraphicFramePr>
               <a:graphicFrameLocks xmlns:a="http://schemas.openxmlformats.org/drawingml/2006/main" noChangeAspect="1"/>
             </wp:cNvGraphicFramePr>
@@ -259,7 +250,7 @@
               <a:graphicData uri="http://schemas.openxmlformats.org/drawingml/2006/picture">
                 <pic:pic xmlns:pic="http://schemas.openxmlformats.org/drawingml/2006/picture">
                   <pic:nvPicPr>
-                    <pic:cNvPr id="1939739568" name="Picture 1" descr="A diagram of a tree&#10;&#10;AI-generated content may be incorrect."/>
+                    <pic:cNvPr id="121382152" name="Picture 1" descr="A diagram of a tree&#10;&#10;AI-generated content may be incorrect."/>
                     <pic:cNvPicPr/>
                   </pic:nvPicPr>
                   <pic:blipFill>
@@ -277,7 +268,7 @@
                   <pic:spPr>
                     <a:xfrm>
                       <a:off x="0" y="0"/>
-                      <a:ext cx="1806269" cy="969112"/>
+                      <a:ext cx="1609846" cy="911973"/>
                     </a:xfrm>
                     <a:prstGeom prst="rect">
                       <a:avLst/>
@@ -301,16 +292,7 @@
           <w:szCs w:val="16"/>
           <w:highlight w:val="green"/>
         </w:rPr>
-        <w:t xml:space="preserve">3 – </w:t>
-      </w:r>
-      <w:proofErr w:type="gramStart"/>
-      <w:r>
-        <w:rPr>
-          <w:sz w:val="16"/>
-          <w:szCs w:val="16"/>
-          <w:highlight w:val="green"/>
-        </w:rPr>
-        <w:t>Trees</w:t>
+        <w:t>3 – Trees</w:t>
       </w:r>
       <w:r>
         <w:rPr>
@@ -333,15 +315,7 @@
           <w:sz w:val="15"/>
           <w:szCs w:val="15"/>
         </w:rPr>
-        <w:t>Preorder</w:t>
-      </w:r>
-      <w:proofErr w:type="gramEnd"/>
-      <w:r>
-        <w:rPr>
-          <w:sz w:val="15"/>
-          <w:szCs w:val="15"/>
-        </w:rPr>
-        <w:t xml:space="preserve">, </w:t>
+        <w:t xml:space="preserve">Preorder, </w:t>
       </w:r>
       <w:proofErr w:type="spellStart"/>
       <w:r>

</xml_diff>